<commit_message>
Implement final grade formatting for report card export and add unit tests
</commit_message>
<xml_diff>
--- a/storage/templates/REPORT CARD.docx
+++ b/storage/templates/REPORT CARD.docx
@@ -374,6 +374,12 @@
                 <w:rFonts w:ascii="Arial" w:hAnsi="Arial" w:cs="Arial"/>
               </w:rPr>
             </w:pPr>
+            <w:r>
+              <w:rPr>
+                <w:rFonts w:ascii="Arial" w:hAnsi="Arial" w:cs="Arial"/>
+              </w:rPr>
+              <w:t>${</w:t>
+            </w:r>
             <w:r>
               <w:rPr>
                 <w:rFonts w:ascii="Arial" w:hAnsi="Arial" w:cs="Arial"/>
@@ -1322,10 +1328,10 @@
         <w:gridCol w:w="351"/>
         <w:gridCol w:w="43"/>
         <w:gridCol w:w="348"/>
-        <w:gridCol w:w="5655"/>
-        <w:gridCol w:w="5635"/>
-        <w:gridCol w:w="5616"/>
-        <w:gridCol w:w="5603"/>
+        <w:gridCol w:w="951"/>
+        <w:gridCol w:w="905"/>
+        <w:gridCol w:w="402"/>
+        <w:gridCol w:w="373"/>
       </w:tblGrid>
       <w:tr>
         <w:tc>
@@ -2959,6 +2965,7 @@
               <w:rPr>
                 <w:rFonts w:ascii="Arial" w:hAnsi="Arial" w:cs="Arial"/>
               </w:rPr>
+              <w:lastRenderedPageBreak/>
               <w:t>Principal</w:t>
             </w:r>
           </w:p>
@@ -3101,7 +3108,6 @@
                 <w:b/>
                 <w:bCs/>
               </w:rPr>
-              <w:lastRenderedPageBreak/>
               <w:t>Certificate of Transfer</w:t>
             </w:r>
           </w:p>

</xml_diff>